<commit_message>
feat(main): add files lab05
</commit_message>
<xml_diff>
--- a/labs/lab05/report/ЛО5_Григорьева.docx
+++ b/labs/lab05/report/ЛО5_Григорьева.docx
@@ -1171,29 +1171,7 @@
         <w:pStyle w:val="BodyText"/>
       </w:pPr>
       <w:r>
-        <w:t xml:space="preserve">В листинге</w:t>
-      </w:r>
-      <w:r>
-        <w:t xml:space="preserve"> </w:t>
-      </w:r>
-      <w:r>
-        <w:t xml:space="preserve">[</w:t>
-      </w:r>
-      <w:r>
-        <w:rPr>
-          <w:b/>
-          <w:bCs/>
-        </w:rPr>
-        <w:t xml:space="preserve">lst:lab5-11?</w:t>
-      </w:r>
-      <w:r>
-        <w:t xml:space="preserve">]</w:t>
-      </w:r>
-      <w:r>
-        <w:t xml:space="preserve"> </w:t>
-      </w:r>
-      <w:r>
-        <w:t xml:space="preserve">представлена программа lab5-11.asm, реализующая ввод строки с клавиатуры и её последующий вывод на экран.</w:t>
+        <w:t xml:space="preserve">В листинге 3.1 представлена программа lab5-11.asm, реализующая ввод строки с клавиатуры и её последующий вывод на экран.</w:t>
       </w:r>
     </w:p>
     <w:bookmarkStart w:id="86" w:name="lst:lab5-11"/>
@@ -2538,29 +2516,7 @@
         <w:pStyle w:val="BodyText"/>
       </w:pPr>
       <w:r>
-        <w:t xml:space="preserve">В листинге</w:t>
-      </w:r>
-      <w:r>
-        <w:t xml:space="preserve"> </w:t>
-      </w:r>
-      <w:r>
-        <w:t xml:space="preserve">[</w:t>
-      </w:r>
-      <w:r>
-        <w:rPr>
-          <w:b/>
-          <w:bCs/>
-        </w:rPr>
-        <w:t xml:space="preserve">lst:lab5-22?</w:t>
-      </w:r>
-      <w:r>
-        <w:t xml:space="preserve">]</w:t>
-      </w:r>
-      <w:r>
-        <w:t xml:space="preserve"> </w:t>
-      </w:r>
-      <w:r>
-        <w:t xml:space="preserve">представлена программа lab5-22.asm, реализующая ввод строки с клавиатуры и её последующий вывод на экран.</w:t>
+        <w:t xml:space="preserve">В листинге 3.2 представлена программа lab5-22.asm, реализующая ввод строки с клавиатуры и её последующий вывод на экран.</w:t>
       </w:r>
     </w:p>
     <w:bookmarkStart w:id="94" w:name="lst:lab5-11"/>

</xml_diff>